<commit_message>
Added Final section to QA Writeup
</commit_message>
<xml_diff>
--- a/Design Documents/Final Submission Contributions/QA writeup.docx
+++ b/Design Documents/Final Submission Contributions/QA writeup.docx
@@ -25,6 +25,303 @@
       </w:r>
       <w:r>
         <w:t>two black suits’ pixel art was too similar, making play confusing at times, especially on small screens.</w:t>
+      </w:r>
+    </w:p>
+    <w:p/>
+    <w:p>
+      <w:r>
+        <w:t>Due to this feedback, we implemented and discussed a few changes, firstly, we created a plan for redesigning the UI</w:t>
+      </w:r>
+      <w:r>
+        <w:t>, although we did not have time to implement all changes</w:t>
+      </w:r>
+    </w:p>
+    <w:p>
+      <w:r>
+        <w:rPr>
+          <w:noProof/>
+        </w:rPr>
+        <w:drawing>
+          <wp:inline distT="0" distB="0" distL="0" distR="0" wp14:anchorId="3F070A6C" wp14:editId="7E4980C6">
+            <wp:extent cx="1675703" cy="3467100"/>
+            <wp:effectExtent l="0" t="0" r="1270" b="0"/>
+            <wp:docPr id="1921008672" name="Picture 1"/>
+            <wp:cNvGraphicFramePr>
+              <a:graphicFrameLocks xmlns:a="http://schemas.openxmlformats.org/drawingml/2006/main" noChangeAspect="1"/>
+            </wp:cNvGraphicFramePr>
+            <a:graphic xmlns:a="http://schemas.openxmlformats.org/drawingml/2006/main">
+              <a:graphicData uri="http://schemas.openxmlformats.org/drawingml/2006/picture">
+                <pic:pic xmlns:pic="http://schemas.openxmlformats.org/drawingml/2006/picture">
+                  <pic:nvPicPr>
+                    <pic:cNvPr id="0" name="Picture 1"/>
+                    <pic:cNvPicPr>
+                      <a:picLocks noChangeAspect="1" noChangeArrowheads="1"/>
+                    </pic:cNvPicPr>
+                  </pic:nvPicPr>
+                  <pic:blipFill>
+                    <a:blip r:embed="rId4" cstate="print">
+                      <a:extLst>
+                        <a:ext uri="{28A0092B-C50C-407E-A947-70E740481C1C}">
+                          <a14:useLocalDpi xmlns:a14="http://schemas.microsoft.com/office/drawing/2010/main" val="0"/>
+                        </a:ext>
+                      </a:extLst>
+                    </a:blip>
+                    <a:srcRect/>
+                    <a:stretch>
+                      <a:fillRect/>
+                    </a:stretch>
+                  </pic:blipFill>
+                  <pic:spPr bwMode="auto">
+                    <a:xfrm>
+                      <a:off x="0" y="0"/>
+                      <a:ext cx="1682703" cy="3481584"/>
+                    </a:xfrm>
+                    <a:prstGeom prst="rect">
+                      <a:avLst/>
+                    </a:prstGeom>
+                    <a:noFill/>
+                    <a:ln>
+                      <a:noFill/>
+                    </a:ln>
+                  </pic:spPr>
+                </pic:pic>
+              </a:graphicData>
+            </a:graphic>
+          </wp:inline>
+        </w:drawing>
+      </w:r>
+      <w:r>
+        <w:rPr>
+          <w:noProof/>
+        </w:rPr>
+        <w:drawing>
+          <wp:inline distT="0" distB="0" distL="0" distR="0" wp14:anchorId="32011D50" wp14:editId="28952F6F">
+            <wp:extent cx="1704975" cy="3469642"/>
+            <wp:effectExtent l="0" t="0" r="0" b="0"/>
+            <wp:docPr id="542672804" name="Picture 2"/>
+            <wp:cNvGraphicFramePr>
+              <a:graphicFrameLocks xmlns:a="http://schemas.openxmlformats.org/drawingml/2006/main" noChangeAspect="1"/>
+            </wp:cNvGraphicFramePr>
+            <a:graphic xmlns:a="http://schemas.openxmlformats.org/drawingml/2006/main">
+              <a:graphicData uri="http://schemas.openxmlformats.org/drawingml/2006/picture">
+                <pic:pic xmlns:pic="http://schemas.openxmlformats.org/drawingml/2006/picture">
+                  <pic:nvPicPr>
+                    <pic:cNvPr id="0" name="Picture 2"/>
+                    <pic:cNvPicPr>
+                      <a:picLocks noChangeAspect="1" noChangeArrowheads="1"/>
+                    </pic:cNvPicPr>
+                  </pic:nvPicPr>
+                  <pic:blipFill>
+                    <a:blip r:embed="rId5" cstate="print">
+                      <a:extLst>
+                        <a:ext uri="{28A0092B-C50C-407E-A947-70E740481C1C}">
+                          <a14:useLocalDpi xmlns:a14="http://schemas.microsoft.com/office/drawing/2010/main" val="0"/>
+                        </a:ext>
+                      </a:extLst>
+                    </a:blip>
+                    <a:srcRect/>
+                    <a:stretch>
+                      <a:fillRect/>
+                    </a:stretch>
+                  </pic:blipFill>
+                  <pic:spPr bwMode="auto">
+                    <a:xfrm>
+                      <a:off x="0" y="0"/>
+                      <a:ext cx="1709664" cy="3479185"/>
+                    </a:xfrm>
+                    <a:prstGeom prst="rect">
+                      <a:avLst/>
+                    </a:prstGeom>
+                    <a:noFill/>
+                    <a:ln>
+                      <a:noFill/>
+                    </a:ln>
+                  </pic:spPr>
+                </pic:pic>
+              </a:graphicData>
+            </a:graphic>
+          </wp:inline>
+        </w:drawing>
+      </w:r>
+    </w:p>
+    <w:p>
+      <w:r>
+        <w:t>For the Play Screen we decided we should move</w:t>
+      </w:r>
+      <w:r>
+        <w:t xml:space="preserve"> each p</w:t>
+      </w:r>
+      <w:r>
+        <w:t xml:space="preserve">layer’s points to their side of the screen to make room in the middle </w:t>
+      </w:r>
+      <w:r>
+        <w:t>f</w:t>
+      </w:r>
+      <w:r>
+        <w:t xml:space="preserve">or a round counter and a button to view the rules. </w:t>
+      </w:r>
+      <w:r>
+        <w:t xml:space="preserve">The design also involves moving the quit button to be inside a </w:t>
+      </w:r>
+      <w:proofErr w:type="spellStart"/>
+      <w:r>
+        <w:t>puse</w:t>
+      </w:r>
+      <w:proofErr w:type="spellEnd"/>
+      <w:r>
+        <w:t xml:space="preserve"> menu, so that one </w:t>
+      </w:r>
+      <w:proofErr w:type="spellStart"/>
+      <w:r>
+        <w:t>miss</w:t>
+      </w:r>
+      <w:r>
+        <w:t>click</w:t>
+      </w:r>
+      <w:proofErr w:type="spellEnd"/>
+      <w:r>
+        <w:t xml:space="preserve"> doesn’t end the game.</w:t>
+      </w:r>
+    </w:p>
+    <w:p/>
+    <w:p>
+      <w:r>
+        <w:t xml:space="preserve">For the rules screen, the main idea for a revamp was to </w:t>
+      </w:r>
+      <w:r>
+        <w:t xml:space="preserve">change it from a grid into a list, allowing us to add more clear buttons and input boxes for each rule, as well as splitting the rules into categories based on their type, </w:t>
+      </w:r>
+      <w:r>
+        <w:t>for example, a section containing any rules that end the game.</w:t>
+      </w:r>
+    </w:p>
+    <w:p>
+      <w:r>
+        <w:lastRenderedPageBreak/>
+        <w:t>We also added more info when the player tries to press play without enough rules selected, to tell them what is needed in terms of minimum rules to play the game.</w:t>
+      </w:r>
+    </w:p>
+    <w:p/>
+    <w:p>
+      <w:r>
+        <w:rPr>
+          <w:noProof/>
+        </w:rPr>
+        <w:drawing>
+          <wp:inline distT="0" distB="0" distL="0" distR="0" wp14:anchorId="78F323C1" wp14:editId="22AF8B31">
+            <wp:extent cx="2513330" cy="3578860"/>
+            <wp:effectExtent l="0" t="0" r="1270" b="2540"/>
+            <wp:docPr id="1151802387" name="Picture 4"/>
+            <wp:cNvGraphicFramePr>
+              <a:graphicFrameLocks xmlns:a="http://schemas.openxmlformats.org/drawingml/2006/main" noChangeAspect="1"/>
+            </wp:cNvGraphicFramePr>
+            <a:graphic xmlns:a="http://schemas.openxmlformats.org/drawingml/2006/main">
+              <a:graphicData uri="http://schemas.openxmlformats.org/drawingml/2006/picture">
+                <pic:pic xmlns:pic="http://schemas.openxmlformats.org/drawingml/2006/picture">
+                  <pic:nvPicPr>
+                    <pic:cNvPr id="0" name="Picture 5"/>
+                    <pic:cNvPicPr>
+                      <a:picLocks noChangeAspect="1" noChangeArrowheads="1"/>
+                    </pic:cNvPicPr>
+                  </pic:nvPicPr>
+                  <pic:blipFill>
+                    <a:blip r:embed="rId6">
+                      <a:extLst>
+                        <a:ext uri="{28A0092B-C50C-407E-A947-70E740481C1C}">
+                          <a14:useLocalDpi xmlns:a14="http://schemas.microsoft.com/office/drawing/2010/main" val="0"/>
+                        </a:ext>
+                      </a:extLst>
+                    </a:blip>
+                    <a:srcRect/>
+                    <a:stretch>
+                      <a:fillRect/>
+                    </a:stretch>
+                  </pic:blipFill>
+                  <pic:spPr bwMode="auto">
+                    <a:xfrm>
+                      <a:off x="0" y="0"/>
+                      <a:ext cx="2513330" cy="3578860"/>
+                    </a:xfrm>
+                    <a:prstGeom prst="rect">
+                      <a:avLst/>
+                    </a:prstGeom>
+                    <a:noFill/>
+                    <a:ln>
+                      <a:noFill/>
+                    </a:ln>
+                  </pic:spPr>
+                </pic:pic>
+              </a:graphicData>
+            </a:graphic>
+          </wp:inline>
+        </w:drawing>
+      </w:r>
+      <w:r>
+        <w:rPr>
+          <w:noProof/>
+        </w:rPr>
+        <w:drawing>
+          <wp:inline distT="0" distB="0" distL="0" distR="0" wp14:anchorId="4A3B91D9" wp14:editId="15DBCDA5">
+            <wp:extent cx="2527919" cy="3597368"/>
+            <wp:effectExtent l="0" t="0" r="6350" b="3175"/>
+            <wp:docPr id="719124427" name="Picture 5"/>
+            <wp:cNvGraphicFramePr>
+              <a:graphicFrameLocks xmlns:a="http://schemas.openxmlformats.org/drawingml/2006/main" noChangeAspect="1"/>
+            </wp:cNvGraphicFramePr>
+            <a:graphic xmlns:a="http://schemas.openxmlformats.org/drawingml/2006/main">
+              <a:graphicData uri="http://schemas.openxmlformats.org/drawingml/2006/picture">
+                <pic:pic xmlns:pic="http://schemas.openxmlformats.org/drawingml/2006/picture">
+                  <pic:nvPicPr>
+                    <pic:cNvPr id="0" name="Picture 6"/>
+                    <pic:cNvPicPr>
+                      <a:picLocks noChangeAspect="1" noChangeArrowheads="1"/>
+                    </pic:cNvPicPr>
+                  </pic:nvPicPr>
+                  <pic:blipFill>
+                    <a:blip r:embed="rId7">
+                      <a:extLst>
+                        <a:ext uri="{28A0092B-C50C-407E-A947-70E740481C1C}">
+                          <a14:useLocalDpi xmlns:a14="http://schemas.microsoft.com/office/drawing/2010/main" val="0"/>
+                        </a:ext>
+                      </a:extLst>
+                    </a:blip>
+                    <a:srcRect/>
+                    <a:stretch>
+                      <a:fillRect/>
+                    </a:stretch>
+                  </pic:blipFill>
+                  <pic:spPr bwMode="auto">
+                    <a:xfrm>
+                      <a:off x="0" y="0"/>
+                      <a:ext cx="2536713" cy="3609883"/>
+                    </a:xfrm>
+                    <a:prstGeom prst="rect">
+                      <a:avLst/>
+                    </a:prstGeom>
+                    <a:noFill/>
+                    <a:ln>
+                      <a:noFill/>
+                    </a:ln>
+                  </pic:spPr>
+                </pic:pic>
+              </a:graphicData>
+            </a:graphic>
+          </wp:inline>
+        </w:drawing>
+      </w:r>
+    </w:p>
+    <w:p>
+      <w:r>
+        <w:t>In terms of the Card art,</w:t>
+      </w:r>
+      <w:r>
+        <w:t xml:space="preserve"> </w:t>
+      </w:r>
+      <w:r>
+        <w:t>we remade the clubs to make It easier to distinguish them from the spades</w:t>
+      </w:r>
+      <w:r>
+        <w:t xml:space="preserve"> (one example of changes made above) we also changed the ace of spade to differentiate it more.</w:t>
       </w:r>
     </w:p>
     <w:sectPr>

</xml_diff>